<commit_message>
Wire the leg gate into the AI research loop: the three-gate decision (real edge AND diversifies book)
Completes the loop: gate() now takes optional candidate_returns + book_returns and runs the second-leg
gate as a THIRD veto alongside falsification (is it a real edge?) + Haiku. Final GO = rail_pass AND
haiku_GO AND leg_gate_pass. An edge that's real but DILUTES the book is NO-GO as a leg (momentum, Case 47)
-- the loop now auto-applies that lesson. Backward-compatible (leg check only runs when returns supplied).
+2 integration tests (diluting edge vetoed; real diversifier passes). AI_RESEARCH_LOOP doc updated with
the 3-gate diagram. The whole second-leg gauntlet is now automated end-to-end. Suite 3461 green, 0 secrets.

Co-Authored-By: Claude Opus 4.8 <noreply@anthropic.com>
</commit_message>
<xml_diff>
--- a/docs/AI_RESEARCH_LOOP.docx
+++ b/docs/AI_RESEARCH_LOOP.docx
@@ -528,13 +528,70 @@
         <w:rPr>
           <w:b/>
         </w:rPr>
-        <w:t>Both must agree.</w:t>
+        <w:t>The SECOND-LEG GATE.</w:t>
       </w:r>
       <w:r>
         <w:rPr>
           <w:b w:val="0"/>
         </w:rPr>
-        <w:t xml:space="preserve"> Final GO = `rail_pass AND haiku_GO`. Disagreement → NO-GO.</w:t>
+        <w:t xml:space="preserve"> A candidate that is a *real edge* still must EARN a place in the deployed</w:t>
+      </w:r>
+    </w:p>
+    <w:p>
+      <w:r>
+        <w:rPr>
+          <w:b w:val="0"/>
+        </w:rPr>
+        <w:t xml:space="preserve">   book — so when its daily returns are supplied, `gate()` runs `leg_gate.evaluate_leg_candidate` (the</w:t>
+      </w:r>
+    </w:p>
+    <w:p>
+      <w:r>
+        <w:rPr>
+          <w:b w:val="0"/>
+        </w:rPr>
+        <w:t xml:space="preserve">   Cases 47–51 gauntlet: positive over the forward window · uncorrelated with the book · *lifts* the</w:t>
+      </w:r>
+    </w:p>
+    <w:p>
+      <w:r>
+        <w:rPr>
+          <w:b w:val="0"/>
+        </w:rPr>
+        <w:t xml:space="preserve">   inverse-vol combined Sharpe · robust across leave-one-year-out · survives the partial-year split). An</w:t>
+      </w:r>
+    </w:p>
+    <w:p>
+      <w:r>
+        <w:rPr>
+          <w:b w:val="0"/>
+        </w:rPr>
+        <w:t xml:space="preserve">   edge that is real but *dilutes* the book is NO-GO as a leg (momentum, Case 47).</w:t>
+      </w:r>
+    </w:p>
+    <w:p>
+      <w:pPr>
+        <w:pStyle w:val="ListNumber"/>
+      </w:pPr>
+      <w:r>
+        <w:rPr>
+          <w:b/>
+        </w:rPr>
+        <w:t>All must agree.</w:t>
+      </w:r>
+      <w:r>
+        <w:rPr>
+          <w:b w:val="0"/>
+        </w:rPr>
+        <w:t xml:space="preserve"> Final GO = `rail_pass AND haiku_GO AND leg_gate_pass` (the leg gate only when</w:t>
+      </w:r>
+    </w:p>
+    <w:p>
+      <w:r>
+        <w:rPr>
+          <w:b w:val="0"/>
+        </w:rPr>
+        <w:t xml:space="preserve">   returns are supplied). Disagreement → NO-GO.</w:t>
       </w:r>
     </w:p>
     <w:p>
@@ -583,7 +640,7 @@
         <w:rPr>
           <w:b w:val="0"/>
         </w:rPr>
-        <w:t xml:space="preserve">        ┌──────── falsification_gate() ────────┐      ┌── haiku_verdict() ──┐</w:t>
+        <w:t xml:space="preserve">   ┌─ falsification_gate() ─┐   ┌─ haiku_verdict() ─┐   ┌─ leg_gate (vs deployed book) ─┐</w:t>
       </w:r>
     </w:p>
     <w:p>
@@ -591,7 +648,7 @@
         <w:rPr>
           <w:b w:val="0"/>
         </w:rPr>
-        <w:t xml:space="preserve">        │ fresh-symbol · regime · cost · DSR   │  AND │ GO / NO-GO + reason │  ─▶  DECISION</w:t>
+        <w:t xml:space="preserve">   │ fresh·regime·cost·DSR  │AND│ GO/NO-GO + reason │AND│ +ve·uncorr·LIFTS·robust·       │ ─▶ DECISION</w:t>
       </w:r>
     </w:p>
     <w:p>
@@ -599,7 +656,7 @@
         <w:rPr>
           <w:b w:val="0"/>
         </w:rPr>
-        <w:t xml:space="preserve">        │   (deterministic, VETO)              │      │ (live, per-regime)  │</w:t>
+        <w:t xml:space="preserve">   │   (deterministic VETO) │   │ (live, per-regime)│   │ partial-year-safe (VETO)      │</w:t>
       </w:r>
     </w:p>
     <w:p>
@@ -607,7 +664,7 @@
         <w:rPr>
           <w:b w:val="0"/>
         </w:rPr>
-        <w:t xml:space="preserve">        └──────────────────────────────────────┘      └─────────────────────┘</w:t>
+        <w:t xml:space="preserve">   └────────────────────────┘   └───────────────────┘   └───────────────────────────────┘</w:t>
       </w:r>
     </w:p>
     <w:p>
@@ -623,7 +680,7 @@
         <w:rPr>
           <w:b w:val="0"/>
         </w:rPr>
-        <w:t>The rail encodes the lessons the project paid for across 23 case studies — three different "edges"</w:t>
+        <w:t>The first rail encodes the lessons the project paid for on overfit "edges" (EAR-PEAD, the short-interest</w:t>
       </w:r>
     </w:p>
     <w:p>
@@ -631,7 +688,21 @@
         <w:rPr>
           <w:b w:val="0"/>
         </w:rPr>
-        <w:t>(EAR-PEAD, the short-interest tilt, accruals) passed every in-sample/in-universe test yet died on the</w:t>
+        <w:t>tilt, accruals — each passed every in-sample test yet died on the fresh-symbol/multi-regime holdout); the</w:t>
+      </w:r>
+    </w:p>
+    <w:p>
+      <w:r>
+        <w:rPr>
+          <w:b/>
+        </w:rPr>
+        <w:t>leg gate encodes the second-leg lessons</w:t>
+      </w:r>
+      <w:r>
+        <w:rPr>
+          <w:b w:val="0"/>
+        </w:rPr>
+        <w:t xml:space="preserve"> (momentum &amp; trend *dilute*; seasonality's lift was a</w:t>
       </w:r>
     </w:p>
     <w:p>
@@ -639,7 +710,15 @@
         <w:rPr>
           <w:b w:val="0"/>
         </w:rPr>
-        <w:t>fresh-symbol or multi-regime holdout. The loop makes those holdouts mandatory, automatically.</w:t>
+        <w:t>partial-year artifact). Both sets of holdouts are now mandatory and automatic — *is it a real edge?* and</w:t>
+      </w:r>
+    </w:p>
+    <w:p>
+      <w:r>
+        <w:rPr>
+          <w:b w:val="0"/>
+        </w:rPr>
+        <w:t>*does it diversify the book?* are two separate, tested, veto-bearing questions.</w:t>
       </w:r>
     </w:p>
     <w:p/>

</xml_diff>